<commit_message>
Use application TXT and V1.0.0 design cover
</commit_message>
<xml_diff>
--- a/assets/design_spec_template.docx
+++ b/assets/design_spec_template.docx
@@ -80,38 +80,10 @@
       </w:pPr>
       <w:r>
         <w:rPr>
-          <w:rFonts w:hint="eastAsia" w:ascii="宋体" w:hAnsi="宋体" w:eastAsia="宋体" w:cs="宋体"/>
-          <w:b/>
-          <w:color w:val="auto"/>
+          <w:rFonts w:ascii="宋体" w:hAnsi="宋体" w:eastAsia="宋体"/>
           <w:sz w:val="52"/>
-          <w:szCs w:val="52"/>
         </w:rPr>
-        <w:t>{{SOFTWARE_NAME}}</w:t>
-      </w:r>
-    </w:p>
-    <w:p>
-      <w:pPr>
-        <w:spacing w:line="760" w:lineRule="exact"/>
-        <w:jc w:val="center"/>
-        <w:rPr>
-          <w:rFonts w:ascii="Times New Roman" w:hAnsi="Times New Roman" w:eastAsia="宋体" w:cs="Times New Roman"/>
-          <w:b/>
-          <w:bCs/>
-          <w:color w:val="auto"/>
-          <w:sz w:val="52"/>
-          <w:szCs w:val="52"/>
-        </w:rPr>
-      </w:pPr>
-      <w:r>
-        <w:rPr>
-          <w:rFonts w:ascii="Times New Roman" w:hAnsi="Times New Roman" w:eastAsia="宋体" w:cs="Times New Roman"/>
-          <w:b/>
-          <w:bCs/>
-          <w:color w:val="auto"/>
-          <w:sz w:val="52"/>
-          <w:szCs w:val="52"/>
-        </w:rPr>
-        <w:t>系统设计说明书</w:t>
+        <w:t>{{SOFTWARE_NAME}}软件说明书</w:t>
       </w:r>
     </w:p>
     <w:p>
@@ -139,26 +111,10 @@
       </w:pPr>
       <w:r>
         <w:rPr>
-          <w:rFonts w:ascii="Times New Roman" w:hAnsi="Times New Roman" w:eastAsia="宋体" w:cs="Times New Roman"/>
-          <w:b/>
-          <w:bCs/>
-          <w:color w:val="auto"/>
-          <w:sz w:val="28"/>
-          <w:szCs w:val="28"/>
+          <w:rFonts w:ascii="Times New Roman" w:hAnsi="Times New Roman"/>
+          <w:sz w:val="44"/>
         </w:rPr>
-        <w:t>V1.</w:t>
-      </w:r>
-      <w:r>
-        <w:rPr>
-          <w:rFonts w:hint="eastAsia" w:ascii="Times New Roman" w:hAnsi="Times New Roman" w:cs="Times New Roman"/>
-          <w:b/>
-          <w:bCs/>
-          <w:color w:val="auto"/>
-          <w:sz w:val="28"/>
-          <w:szCs w:val="28"/>
-          <w:lang w:val="en-US" w:eastAsia="zh-CN"/>
-        </w:rPr>
-        <w:t>0</w:t>
+        <w:t>V1.0.0</w:t>
       </w:r>
     </w:p>
     <w:p>
@@ -767,7 +723,7 @@
         <w:b w:val="0"/>
         <w:sz w:val="18"/>
       </w:rPr>
-      <w:t>V1.0</w:t>
+      <w:t>V1.0.0</w:t>
     </w:r>
   </w:p>
 </w:hdr>

</xml_diff>